<commit_message>
Add RoBERTa citation and fix reference ordering
</commit_message>
<xml_diff>
--- a/report/Pidgin-Sentiment-Report.docx
+++ b/report/Pidgin-Sentiment-Report.docx
@@ -44,7 +44,7 @@
         </w:p>
       </w:sdtContent>
     </w:sdt>
-    <w:bookmarkStart w:id="46" w:name="X862ca5ce503f2c12832814cb4aec9ff4b56fa30"/>
+    <w:bookmarkStart w:id="55" w:name="X862ca5ce503f2c12832814cb4aec9ff4b56fa30"/>
     <w:p>
       <w:pPr>
         <w:pStyle w:val="Heading1"/>
@@ -68,7 +68,7 @@
         <w:t xml:space="preserve"> </w:t>
       </w:r>
       <w:r>
-        <w:t xml:space="preserve">Levison</w:t>
+        <w:t xml:space="preserve">HonourGod Kilechukwu Levison</w:t>
       </w:r>
       <w:r>
         <w:t xml:space="preserve"> </w:t>
@@ -84,7 +84,7 @@
         <w:t xml:space="preserve"> </w:t>
       </w:r>
       <w:r>
-        <w:t xml:space="preserve">Machine Learning Techniques II — Summative Project</w:t>
+        <w:t xml:space="preserve">Machine Learning Techniques I — Summative Project</w:t>
       </w:r>
       <w:r>
         <w:t xml:space="preserve"> </w:t>
@@ -400,25 +400,55 @@
         <w:t xml:space="preserve"> </w:t>
       </w:r>
       <w:r>
-        <w:t xml:space="preserve">spoken across Nigeria and neighbouring countries. It is one of the main</w:t>
-      </w:r>
-      <w:r>
-        <w:t xml:space="preserve"> </w:t>
-      </w:r>
-      <w:r>
-        <w:t xml:space="preserve">languages of informal Nigerian online discussion. It also has far fewer NLP</w:t>
-      </w:r>
-      <w:r>
-        <w:t xml:space="preserve"> </w:t>
-      </w:r>
-      <w:r>
-        <w:t xml:space="preserve">resources than the size of its speaker population would suggest, which is the</w:t>
-      </w:r>
-      <w:r>
-        <w:t xml:space="preserve"> </w:t>
-      </w:r>
-      <w:r>
-        <w:t xml:space="preserve">usual position for African languages.</w:t>
+        <w:t xml:space="preserve">spoken across Nigeria and neighbouring countries. Ethnologue’s 2025 figures put</w:t>
+      </w:r>
+      <w:r>
+        <w:t xml:space="preserve"> </w:t>
+      </w:r>
+      <w:r>
+        <w:t xml:space="preserve">it at roughly 121 million speakers, of whom about 5 million use it as a first</w:t>
+      </w:r>
+      <w:r>
+        <w:t xml:space="preserve"> </w:t>
+      </w:r>
+      <w:r>
+        <w:t xml:space="preserve">language and 116 million as a second, which makes it the most widely spoken</w:t>
+      </w:r>
+      <w:r>
+        <w:t xml:space="preserve"> </w:t>
+      </w:r>
+      <w:r>
+        <w:t xml:space="preserve">language in Africa and around the fourteenth most spoken in the world. Against a</w:t>
+      </w:r>
+      <w:r>
+        <w:t xml:space="preserve"> </w:t>
+      </w:r>
+      <w:r>
+        <w:t xml:space="preserve">Nigerian population of roughly 240 million, that is close to half the country.</w:t>
+      </w:r>
+      <w:r>
+        <w:t xml:space="preserve"> </w:t>
+      </w:r>
+      <w:r>
+        <w:t xml:space="preserve">Adelani et al. (2024) cite a comparable figure of about 120 million. It has no</w:t>
+      </w:r>
+      <w:r>
+        <w:t xml:space="preserve"> </w:t>
+      </w:r>
+      <w:r>
+        <w:t xml:space="preserve">official status and is used almost entirely informally, which is part of why it</w:t>
+      </w:r>
+      <w:r>
+        <w:t xml:space="preserve"> </w:t>
+      </w:r>
+      <w:r>
+        <w:t xml:space="preserve">is under-resourced: the written Pidgin that exists is mostly social media and</w:t>
+      </w:r>
+      <w:r>
+        <w:t xml:space="preserve"> </w:t>
+      </w:r>
+      <w:r>
+        <w:t xml:space="preserve">forum text rather than the news and government corpora that NLP usually draws on.</w:t>
       </w:r>
     </w:p>
     <w:p>
@@ -426,6 +456,82 @@
         <w:pStyle w:val="BodyText"/>
       </w:pPr>
       <w:r>
+        <w:t xml:space="preserve">The second half of the problem is where that language meets money. Nigeria ranks</w:t>
+      </w:r>
+      <w:r>
+        <w:t xml:space="preserve"> </w:t>
+      </w:r>
+      <w:r>
+        <w:t xml:space="preserve">third in the Chainalysis Global Crypto Adoption Index for 2026 and, more to the</w:t>
+      </w:r>
+      <w:r>
+        <w:t xml:space="preserve"> </w:t>
+      </w:r>
+      <w:r>
+        <w:t xml:space="preserve">point here, first in the world for domestic peer-to-peer cryptocurrency activity.</w:t>
+      </w:r>
+      <w:r>
+        <w:t xml:space="preserve"> </w:t>
+      </w:r>
+      <w:r>
+        <w:t xml:space="preserve">Earlier editions placed it second in 2024 and sixth in 2025, so the exact rank</w:t>
+      </w:r>
+      <w:r>
+        <w:t xml:space="preserve"> </w:t>
+      </w:r>
+      <w:r>
+        <w:t xml:space="preserve">moves, but the pattern does not: a very large volume of ordinary retail crypto</w:t>
+      </w:r>
+      <w:r>
+        <w:t xml:space="preserve"> </w:t>
+      </w:r>
+      <w:r>
+        <w:t xml:space="preserve">activity, much of it peer-to-peer, conducted by a population half of whom speak</w:t>
+      </w:r>
+      <w:r>
+        <w:t xml:space="preserve"> </w:t>
+      </w:r>
+      <w:r>
+        <w:t xml:space="preserve">Pidgin.</w:t>
+      </w:r>
+    </w:p>
+    <w:p>
+      <w:pPr>
+        <w:pStyle w:val="BodyText"/>
+      </w:pPr>
+      <w:r>
+        <w:t xml:space="preserve">Those two facts meet on Nigerian forums and social media, and they create a</w:t>
+      </w:r>
+      <w:r>
+        <w:t xml:space="preserve"> </w:t>
+      </w:r>
+      <w:r>
+        <w:t xml:space="preserve">practical gap. A company running an exchange or a payment service in Nigeria,</w:t>
+      </w:r>
+      <w:r>
+        <w:t xml:space="preserve"> </w:t>
+      </w:r>
+      <w:r>
+        <w:t xml:space="preserve">and anyone studying how users talk about one, needs to read sentiment in Pidgin.</w:t>
+      </w:r>
+      <w:r>
+        <w:t xml:space="preserve"> </w:t>
+      </w:r>
+      <w:r>
+        <w:t xml:space="preserve">If they do not speak it themselves, they need a model. This project asks whether</w:t>
+      </w:r>
+      <w:r>
+        <w:t xml:space="preserve"> </w:t>
+      </w:r>
+      <w:r>
+        <w:t xml:space="preserve">the models that exist are fit for that.</w:t>
+      </w:r>
+    </w:p>
+    <w:p>
+      <w:pPr>
+        <w:pStyle w:val="BodyText"/>
+      </w:pPr>
+      <w:r>
         <w:t xml:space="preserve">I chose this language because I speak it, which matters for a project that</w:t>
       </w:r>
       <w:r>
@@ -444,45 +550,19 @@
         <w:t xml:space="preserve"> </w:t>
       </w:r>
       <w:r>
-        <w:t xml:space="preserve">says.</w:t>
-      </w:r>
-    </w:p>
-    <w:p>
-      <w:pPr>
-        <w:pStyle w:val="BodyText"/>
-      </w:pPr>
-      <w:r>
-        <w:t xml:space="preserve">I chose financial and crypto discussion as the application because that is where</w:t>
-      </w:r>
-      <w:r>
-        <w:t xml:space="preserve"> </w:t>
-      </w:r>
-      <w:r>
-        <w:t xml:space="preserve">a Pidgin sentiment model would actually be used in Nigeria. Peer-to-peer trading,</w:t>
-      </w:r>
-      <w:r>
-        <w:t xml:space="preserve"> </w:t>
-      </w:r>
-      <w:r>
-        <w:t xml:space="preserve">mobile money and exchange platforms generate a large amount of Pidgin discussion,</w:t>
-      </w:r>
-      <w:r>
-        <w:t xml:space="preserve"> </w:t>
-      </w:r>
-      <w:r>
-        <w:t xml:space="preserve">and a company wanting to know how users talk about its service would need exactly</w:t>
-      </w:r>
-      <w:r>
-        <w:t xml:space="preserve"> </w:t>
-      </w:r>
-      <w:r>
-        <w:t xml:space="preserve">this tool. I follow that discussion closely, which helped when deciding whether a</w:t>
-      </w:r>
-      <w:r>
-        <w:t xml:space="preserve"> </w:t>
-      </w:r>
-      <w:r>
-        <w:t xml:space="preserve">post expressed a stance or was simply explaining how something works.</w:t>
+        <w:t xml:space="preserve">says. I also follow Nigerian crypto discussion closely, which helped when</w:t>
+      </w:r>
+      <w:r>
+        <w:t xml:space="preserve"> </w:t>
+      </w:r>
+      <w:r>
+        <w:t xml:space="preserve">deciding whether a post expressed a stance or was simply explaining how</w:t>
+      </w:r>
+      <w:r>
+        <w:t xml:space="preserve"> </w:t>
+      </w:r>
+      <w:r>
+        <w:t xml:space="preserve">something works.</w:t>
       </w:r>
     </w:p>
     <w:p>
@@ -764,7 +844,7 @@
       </w:r>
     </w:p>
     <w:bookmarkEnd w:id="11"/>
-    <w:bookmarkStart w:id="19" w:name="dataset-and-data-preparation"/>
+    <w:bookmarkStart w:id="22" w:name="dataset-and-data-preparation"/>
     <w:p>
       <w:pPr>
         <w:pStyle w:val="Heading2"/>
@@ -835,7 +915,7 @@
       </w:r>
     </w:p>
     <w:bookmarkEnd w:id="12"/>
-    <w:bookmarkStart w:id="13" w:name="what-the-audit-found"/>
+    <w:bookmarkStart w:id="16" w:name="what-the-audit-found"/>
     <w:p>
       <w:pPr>
         <w:pStyle w:val="Heading3"/>
@@ -1133,6 +1213,93 @@
     </w:p>
     <w:p>
       <w:pPr>
+        <w:pStyle w:val="CaptionedFigure"/>
+      </w:pPr>
+      <w:r>
+        <w:drawing>
+          <wp:inline>
+            <wp:extent cx="5334000" cy="3033712"/>
+            <wp:effectExtent b="0" l="0" r="0" t="0"/>
+            <wp:docPr descr="Class distribution across the three splits. Neutral is 1.5% of training data and 10.4% of the test set." title="" id="14" name="Picture"/>
+            <a:graphic>
+              <a:graphicData uri="http://schemas.openxmlformats.org/drawingml/2006/picture">
+                <pic:pic>
+                  <pic:nvPicPr>
+                    <pic:cNvPr descr="../results/figures/class_distribution.png" id="15" name="Picture"/>
+                    <pic:cNvPicPr>
+                      <a:picLocks noChangeArrowheads="1" noChangeAspect="1"/>
+                    </pic:cNvPicPr>
+                  </pic:nvPicPr>
+                  <pic:blipFill>
+                    <a:blip r:embed="rId13"/>
+                    <a:stretch>
+                      <a:fillRect/>
+                    </a:stretch>
+                  </pic:blipFill>
+                  <pic:spPr bwMode="auto">
+                    <a:xfrm>
+                      <a:off x="0" y="0"/>
+                      <a:ext cx="5334000" cy="3033712"/>
+                    </a:xfrm>
+                    <a:prstGeom prst="rect">
+                      <a:avLst/>
+                    </a:prstGeom>
+                    <a:noFill/>
+                    <a:ln w="9525">
+                      <a:noFill/>
+                      <a:headEnd/>
+                      <a:tailEnd/>
+                    </a:ln>
+                  </pic:spPr>
+                </pic:pic>
+              </a:graphicData>
+            </a:graphic>
+          </wp:inline>
+        </w:drawing>
+      </w:r>
+    </w:p>
+    <w:p>
+      <w:pPr>
+        <w:pStyle w:val="ImageCaption"/>
+      </w:pPr>
+      <w:r>
+        <w:t xml:space="preserve">Class distribution across the three splits. Neutral is 1.5% of training data</w:t>
+      </w:r>
+      <w:r>
+        <w:t xml:space="preserve"> </w:t>
+      </w:r>
+      <w:r>
+        <w:t xml:space="preserve">and 10.4% of the test set.</w:t>
+      </w:r>
+    </w:p>
+    <w:p>
+      <w:pPr>
+        <w:pStyle w:val="BodyText"/>
+      </w:pPr>
+      <w:r>
+        <w:rPr>
+          <w:i/>
+          <w:iCs/>
+        </w:rPr>
+        <w:t xml:space="preserve">Figure 1. Label distribution by split. The training and test splits are drawn</w:t>
+      </w:r>
+      <w:r>
+        <w:rPr>
+          <w:i/>
+          <w:iCs/>
+        </w:rPr>
+        <w:t xml:space="preserve"> </w:t>
+      </w:r>
+      <w:r>
+        <w:rPr>
+          <w:i/>
+          <w:iCs/>
+        </w:rPr>
+        <w:t xml:space="preserve">from different label distributions, and the neutral class is the one that moves.</w:t>
+      </w:r>
+    </w:p>
+    <w:p>
+      <w:pPr>
         <w:pStyle w:val="BodyText"/>
       </w:pPr>
       <w:r>
@@ -1351,8 +1518,8 @@
         <w:t xml:space="preserve">with itself rather than the model being wrong.</w:t>
       </w:r>
     </w:p>
-    <w:bookmarkEnd w:id="13"/>
-    <w:bookmarkStart w:id="14" w:name="three-training-files"/>
+    <w:bookmarkEnd w:id="16"/>
+    <w:bookmarkStart w:id="17" w:name="three-training-files"/>
     <w:p>
       <w:pPr>
         <w:pStyle w:val="Heading3"/>
@@ -1512,8 +1679,8 @@
         <w:t xml:space="preserve">the row count fixed and lets the leakage be measured on its own.</w:t>
       </w:r>
     </w:p>
-    <w:bookmarkEnd w:id="14"/>
-    <w:bookmarkStart w:id="15" w:name="preprocessing"/>
+    <w:bookmarkEnd w:id="17"/>
+    <w:bookmarkStart w:id="18" w:name="preprocessing"/>
     <w:p>
       <w:pPr>
         <w:pStyle w:val="Heading3"/>
@@ -1569,8 +1736,8 @@
         <w:t xml:space="preserve">to carry sentiment, as Section 7 shows.</w:t>
       </w:r>
     </w:p>
-    <w:bookmarkEnd w:id="15"/>
-    <w:bookmarkStart w:id="16" w:name="the-finance-and-crypto-test-set"/>
+    <w:bookmarkEnd w:id="18"/>
+    <w:bookmarkStart w:id="19" w:name="the-finance-and-crypto-test-set"/>
     <w:p>
       <w:pPr>
         <w:pStyle w:val="Heading3"/>
@@ -2193,8 +2360,8 @@
         <w:t xml:space="preserve">labelling, against 10.4% in AfriSenti.</w:t>
       </w:r>
     </w:p>
-    <w:bookmarkEnd w:id="16"/>
-    <w:bookmarkStart w:id="17" w:name="annotation-reliability"/>
+    <w:bookmarkEnd w:id="19"/>
+    <w:bookmarkStart w:id="20" w:name="annotation-reliability"/>
     <w:p>
       <w:pPr>
         <w:pStyle w:val="Heading3"/>
@@ -2707,8 +2874,8 @@
         <w:t xml:space="preserve">this, and it does.</w:t>
       </w:r>
     </w:p>
-    <w:bookmarkEnd w:id="17"/>
-    <w:bookmarkStart w:id="18" w:name="adjudication"/>
+    <w:bookmarkEnd w:id="20"/>
+    <w:bookmarkStart w:id="21" w:name="adjudication"/>
     <w:p>
       <w:pPr>
         <w:pStyle w:val="Heading3"/>
@@ -2934,9 +3101,9 @@
         </w:pict>
       </w:r>
     </w:p>
-    <w:bookmarkEnd w:id="18"/>
-    <w:bookmarkEnd w:id="19"/>
-    <w:bookmarkStart w:id="26" w:name="methodology"/>
+    <w:bookmarkEnd w:id="21"/>
+    <w:bookmarkEnd w:id="22"/>
+    <w:bookmarkStart w:id="29" w:name="methodology"/>
     <w:p>
       <w:pPr>
         <w:pStyle w:val="Heading2"/>
@@ -2945,7 +3112,7 @@
         <w:t xml:space="preserve">5. Methodology</w:t>
       </w:r>
     </w:p>
-    <w:bookmarkStart w:id="20" w:name="baseline"/>
+    <w:bookmarkStart w:id="23" w:name="baseline"/>
     <w:p>
       <w:pPr>
         <w:pStyle w:val="Heading3"/>
@@ -3037,8 +3204,8 @@
         <w:t xml:space="preserve">small they are mostly typos.</w:t>
       </w:r>
     </w:p>
-    <w:bookmarkEnd w:id="20"/>
-    <w:bookmarkStart w:id="21" w:name="word2vec-and-bilstm"/>
+    <w:bookmarkEnd w:id="23"/>
+    <w:bookmarkStart w:id="24" w:name="word2vec-and-bilstm"/>
     <w:p>
       <w:pPr>
         <w:pStyle w:val="Heading3"/>
@@ -3138,8 +3305,8 @@
         <w:t xml:space="preserve">sit anywhere.</w:t>
       </w:r>
     </w:p>
-    <w:bookmarkEnd w:id="21"/>
-    <w:bookmarkStart w:id="22" w:name="transformers"/>
+    <w:bookmarkEnd w:id="24"/>
+    <w:bookmarkStart w:id="25" w:name="transformers"/>
     <w:p>
       <w:pPr>
         <w:pStyle w:val="Heading3"/>
@@ -3391,8 +3558,8 @@
         <w:t xml:space="preserve">here would be testing it on its own training data.</w:t>
       </w:r>
     </w:p>
-    <w:bookmarkEnd w:id="22"/>
-    <w:bookmarkStart w:id="23" w:name="training"/>
+    <w:bookmarkEnd w:id="25"/>
+    <w:bookmarkStart w:id="26" w:name="training"/>
     <w:p>
       <w:pPr>
         <w:pStyle w:val="Heading3"/>
@@ -3497,8 +3664,8 @@
         <w:t xml:space="preserve">macro F1 points to 1.2.</w:t>
       </w:r>
     </w:p>
-    <w:bookmarkEnd w:id="23"/>
-    <w:bookmarkStart w:id="24" w:name="class-weighting"/>
+    <w:bookmarkEnd w:id="26"/>
+    <w:bookmarkStart w:id="27" w:name="class-weighting"/>
     <w:p>
       <w:pPr>
         <w:pStyle w:val="Heading3"/>
@@ -3653,8 +3820,8 @@
         <w:t xml:space="preserve">rate. The derivation above is why the raw weights are correct as they stand.</w:t>
       </w:r>
     </w:p>
-    <w:bookmarkEnd w:id="24"/>
-    <w:bookmarkStart w:id="25" w:name="evaluation"/>
+    <w:bookmarkEnd w:id="27"/>
+    <w:bookmarkStart w:id="28" w:name="evaluation"/>
     <w:p>
       <w:pPr>
         <w:pStyle w:val="Heading3"/>
@@ -3734,9 +3901,9 @@
         </w:pict>
       </w:r>
     </w:p>
-    <w:bookmarkEnd w:id="25"/>
-    <w:bookmarkEnd w:id="26"/>
-    <w:bookmarkStart w:id="33" w:name="experiments-and-results"/>
+    <w:bookmarkEnd w:id="28"/>
+    <w:bookmarkEnd w:id="29"/>
+    <w:bookmarkStart w:id="36" w:name="experiments-and-results"/>
     <w:p>
       <w:pPr>
         <w:pStyle w:val="Heading2"/>
@@ -3745,7 +3912,7 @@
         <w:t xml:space="preserve">6. Experiments and Results</w:t>
       </w:r>
     </w:p>
-    <w:bookmarkStart w:id="27" w:name="model-comparison"/>
+    <w:bookmarkStart w:id="30" w:name="model-comparison"/>
     <w:p>
       <w:pPr>
         <w:pStyle w:val="Heading3"/>
@@ -4429,8 +4596,8 @@
         <w:t xml:space="preserve">are worth about 2.6 accuracy points but no more.</w:t>
       </w:r>
     </w:p>
-    <w:bookmarkEnd w:id="27"/>
-    <w:bookmarkStart w:id="28" w:name="class-weighting-1"/>
+    <w:bookmarkEnd w:id="30"/>
+    <w:bookmarkStart w:id="31" w:name="class-weighting-1"/>
     <w:p>
       <w:pPr>
         <w:pStyle w:val="Heading3"/>
@@ -4593,8 +4760,8 @@
         <w:t xml:space="preserve">51 examples is an information problem and weighting is not information.</w:t>
       </w:r>
     </w:p>
-    <w:bookmarkEnd w:id="28"/>
-    <w:bookmarkStart w:id="29" w:name="how-much-the-leakage-inflates-scores"/>
+    <w:bookmarkEnd w:id="31"/>
+    <w:bookmarkStart w:id="32" w:name="how-much-the-leakage-inflates-scores"/>
     <w:p>
       <w:pPr>
         <w:pStyle w:val="Heading3"/>
@@ -4950,8 +5117,8 @@
         <w:t xml:space="preserve">is recognising tweets it has already seen.</w:t>
       </w:r>
     </w:p>
-    <w:bookmarkEnd w:id="29"/>
-    <w:bookmarkStart w:id="30" w:name="measurement-noise"/>
+    <w:bookmarkEnd w:id="32"/>
+    <w:bookmarkStart w:id="33" w:name="measurement-noise"/>
     <w:p>
       <w:pPr>
         <w:pStyle w:val="Heading3"/>
@@ -5121,8 +5288,8 @@
         <w:t xml:space="preserve">smaller than these figures is not a difference.</w:t>
       </w:r>
     </w:p>
-    <w:bookmarkEnd w:id="30"/>
-    <w:bookmarkStart w:id="31" w:name="final-result"/>
+    <w:bookmarkEnd w:id="33"/>
+    <w:bookmarkStart w:id="34" w:name="final-result"/>
     <w:p>
       <w:pPr>
         <w:pStyle w:val="Heading3"/>
@@ -5487,8 +5654,8 @@
         <w:t xml:space="preserve">predicts the class.</w:t>
       </w:r>
     </w:p>
-    <w:bookmarkEnd w:id="31"/>
-    <w:bookmarkStart w:id="32" w:name="can-more-neutral-data-rescue-it"/>
+    <w:bookmarkEnd w:id="34"/>
+    <w:bookmarkStart w:id="35" w:name="can-more-neutral-data-rescue-it"/>
     <w:p>
       <w:pPr>
         <w:pStyle w:val="Heading3"/>
@@ -5920,9 +6087,9 @@
         </w:pict>
       </w:r>
     </w:p>
-    <w:bookmarkEnd w:id="32"/>
-    <w:bookmarkEnd w:id="33"/>
-    <w:bookmarkStart w:id="40" w:name="error-analysis-and-discussion"/>
+    <w:bookmarkEnd w:id="35"/>
+    <w:bookmarkEnd w:id="36"/>
+    <w:bookmarkStart w:id="49" w:name="error-analysis-and-discussion"/>
     <w:p>
       <w:pPr>
         <w:pStyle w:val="Heading2"/>
@@ -5931,7 +6098,7 @@
         <w:t xml:space="preserve">7. Error Analysis and Discussion</w:t>
       </w:r>
     </w:p>
-    <w:bookmarkStart w:id="34" w:name="where-the-errors-are"/>
+    <w:bookmarkStart w:id="40" w:name="where-the-errors-are"/>
     <w:p>
       <w:pPr>
         <w:pStyle w:val="Heading3"/>
@@ -6218,9 +6385,96 @@
     </w:tbl>
     <w:p>
       <w:pPr>
+        <w:pStyle w:val="CaptionedFigure"/>
+      </w:pPr>
+      <w:r>
+        <w:drawing>
+          <wp:inline>
+            <wp:extent cx="4754880" cy="4023360"/>
+            <wp:effectExtent b="0" l="0" r="0" t="0"/>
+            <wp:docPr descr="Confusion matrix on the AfriSenti test split. The neutral row is empty: no neutral prediction is ever made." title="" id="38" name="Picture"/>
+            <a:graphic>
+              <a:graphicData uri="http://schemas.openxmlformats.org/drawingml/2006/picture">
+                <pic:pic>
+                  <pic:nvPicPr>
+                    <pic:cNvPr descr="../results/figures/cm_afro-xlmr-base-weighted-seed42_test.png" id="39" name="Picture"/>
+                    <pic:cNvPicPr>
+                      <a:picLocks noChangeArrowheads="1" noChangeAspect="1"/>
+                    </pic:cNvPicPr>
+                  </pic:nvPicPr>
+                  <pic:blipFill>
+                    <a:blip r:embed="rId37"/>
+                    <a:stretch>
+                      <a:fillRect/>
+                    </a:stretch>
+                  </pic:blipFill>
+                  <pic:spPr bwMode="auto">
+                    <a:xfrm>
+                      <a:off x="0" y="0"/>
+                      <a:ext cx="4754880" cy="4023360"/>
+                    </a:xfrm>
+                    <a:prstGeom prst="rect">
+                      <a:avLst/>
+                    </a:prstGeom>
+                    <a:noFill/>
+                    <a:ln w="9525">
+                      <a:noFill/>
+                      <a:headEnd/>
+                      <a:tailEnd/>
+                    </a:ln>
+                  </pic:spPr>
+                </pic:pic>
+              </a:graphicData>
+            </a:graphic>
+          </wp:inline>
+        </w:drawing>
+      </w:r>
+    </w:p>
+    <w:p>
+      <w:pPr>
+        <w:pStyle w:val="ImageCaption"/>
+      </w:pPr>
+      <w:r>
+        <w:t xml:space="preserve">Confusion matrix on the AfriSenti test split. The neutral row is empty: no</w:t>
+      </w:r>
+      <w:r>
+        <w:t xml:space="preserve"> </w:t>
+      </w:r>
+      <w:r>
+        <w:t xml:space="preserve">neutral prediction is ever made.</w:t>
+      </w:r>
+    </w:p>
+    <w:p>
+      <w:pPr>
         <w:pStyle w:val="BodyText"/>
       </w:pPr>
       <w:r>
+        <w:rPr>
+          <w:i/>
+          <w:iCs/>
+        </w:rPr>
+        <w:t xml:space="preserve">Figure 2. Confusion matrix on the AfriSenti test split, seed 42. Rows are true</w:t>
+      </w:r>
+      <w:r>
+        <w:rPr>
+          <w:i/>
+          <w:iCs/>
+        </w:rPr>
+        <w:t xml:space="preserve"> </w:t>
+      </w:r>
+      <w:r>
+        <w:rPr>
+          <w:i/>
+          <w:iCs/>
+        </w:rPr>
+        <w:t xml:space="preserve">labels, columns predictions, shaded by row share. The neutral column is empty.</w:t>
+      </w:r>
+    </w:p>
+    <w:p>
+      <w:pPr>
+        <w:pStyle w:val="BodyText"/>
+      </w:pPr>
+      <w:r>
         <w:t xml:space="preserve">Neutral does not fail at random. It splits between the two poles, leaning</w:t>
       </w:r>
       <w:r>
@@ -6236,8 +6490,8 @@
         <w:t xml:space="preserve">no neutral region at all; every post is pushed to one side or the other.</w:t>
       </w:r>
     </w:p>
-    <w:bookmarkEnd w:id="34"/>
-    <w:bookmarkStart w:id="35" w:name="length"/>
+    <w:bookmarkEnd w:id="40"/>
+    <w:bookmarkStart w:id="41" w:name="length"/>
     <w:p>
       <w:pPr>
         <w:pStyle w:val="Heading3"/>
@@ -6464,8 +6718,8 @@
         <w:t xml:space="preserve">one or two informative tokens.</w:t>
       </w:r>
     </w:p>
-    <w:bookmarkEnd w:id="35"/>
-    <w:bookmarkStart w:id="36" w:name="X0eb7e5189ae46bac3d8aeda9f72ac458c1aa682"/>
+    <w:bookmarkEnd w:id="41"/>
+    <w:bookmarkStart w:id="42" w:name="X0eb7e5189ae46bac3d8aeda9f72ac458c1aa682"/>
     <w:p>
       <w:pPr>
         <w:pStyle w:val="Heading3"/>
@@ -6677,8 +6931,8 @@
         <w:t xml:space="preserve">sentiment that the text sometimes does not, and the subword tokeniser keeps them.</w:t>
       </w:r>
     </w:p>
-    <w:bookmarkEnd w:id="36"/>
-    <w:bookmarkStart w:id="37" w:name="errors-that-are-not-the-models-fault"/>
+    <w:bookmarkEnd w:id="42"/>
+    <w:bookmarkStart w:id="43" w:name="errors-that-are-not-the-models-fault"/>
     <w:p>
       <w:pPr>
         <w:pStyle w:val="Heading3"/>
@@ -6719,8 +6973,8 @@
         <w:t xml:space="preserve">benchmark contradicting itself.</w:t>
       </w:r>
     </w:p>
-    <w:bookmarkEnd w:id="37"/>
-    <w:bookmarkStart w:id="38" w:name="domain-transfer"/>
+    <w:bookmarkEnd w:id="43"/>
+    <w:bookmarkStart w:id="47" w:name="domain-transfer"/>
     <w:p>
       <w:pPr>
         <w:pStyle w:val="Heading3"/>
@@ -7572,6 +7826,107 @@
     </w:p>
     <w:p>
       <w:pPr>
+        <w:pStyle w:val="CaptionedFigure"/>
+      </w:pPr>
+      <w:r>
+        <w:drawing>
+          <wp:inline>
+            <wp:extent cx="4754880" cy="4023360"/>
+            <wp:effectExtent b="0" l="0" r="0" t="0"/>
+            <wp:docPr descr="Confusion matrix on the finance test set. Nearly half the posts are neutral and none are recognised." title="" id="45" name="Picture"/>
+            <a:graphic>
+              <a:graphicData uri="http://schemas.openxmlformats.org/drawingml/2006/picture">
+                <pic:pic>
+                  <pic:nvPicPr>
+                    <pic:cNvPr descr="../results/figures/cm_afro-xlmr-base-weighted-seed42_finance_test.png" id="46" name="Picture"/>
+                    <pic:cNvPicPr>
+                      <a:picLocks noChangeArrowheads="1" noChangeAspect="1"/>
+                    </pic:cNvPicPr>
+                  </pic:nvPicPr>
+                  <pic:blipFill>
+                    <a:blip r:embed="rId44"/>
+                    <a:stretch>
+                      <a:fillRect/>
+                    </a:stretch>
+                  </pic:blipFill>
+                  <pic:spPr bwMode="auto">
+                    <a:xfrm>
+                      <a:off x="0" y="0"/>
+                      <a:ext cx="4754880" cy="4023360"/>
+                    </a:xfrm>
+                    <a:prstGeom prst="rect">
+                      <a:avLst/>
+                    </a:prstGeom>
+                    <a:noFill/>
+                    <a:ln w="9525">
+                      <a:noFill/>
+                      <a:headEnd/>
+                      <a:tailEnd/>
+                    </a:ln>
+                  </pic:spPr>
+                </pic:pic>
+              </a:graphicData>
+            </a:graphic>
+          </wp:inline>
+        </w:drawing>
+      </w:r>
+    </w:p>
+    <w:p>
+      <w:pPr>
+        <w:pStyle w:val="ImageCaption"/>
+      </w:pPr>
+      <w:r>
+        <w:t xml:space="preserve">Confusion matrix on the finance test set. Nearly half the posts are neutral and</w:t>
+      </w:r>
+      <w:r>
+        <w:t xml:space="preserve"> </w:t>
+      </w:r>
+      <w:r>
+        <w:t xml:space="preserve">none are recognised.</w:t>
+      </w:r>
+    </w:p>
+    <w:p>
+      <w:pPr>
+        <w:pStyle w:val="BodyText"/>
+      </w:pPr>
+      <w:r>
+        <w:rPr>
+          <w:i/>
+          <w:iCs/>
+        </w:rPr>
+        <w:t xml:space="preserve">Figure 3. Confusion matrix on the adjudicated finance test set. 41 of the 93</w:t>
+      </w:r>
+      <w:r>
+        <w:rPr>
+          <w:i/>
+          <w:iCs/>
+        </w:rPr>
+        <w:t xml:space="preserve"> </w:t>
+      </w:r>
+      <w:r>
+        <w:rPr>
+          <w:i/>
+          <w:iCs/>
+        </w:rPr>
+        <w:t xml:space="preserve">posts are neutral and the model assigns none of them correctly, which caps its</w:t>
+      </w:r>
+      <w:r>
+        <w:rPr>
+          <w:i/>
+          <w:iCs/>
+        </w:rPr>
+        <w:t xml:space="preserve"> </w:t>
+      </w:r>
+      <w:r>
+        <w:rPr>
+          <w:i/>
+          <w:iCs/>
+        </w:rPr>
+        <w:t xml:space="preserve">accuracy at 55.9% before it classifies anything.</w:t>
+      </w:r>
+    </w:p>
+    <w:p>
+      <w:pPr>
         <w:pStyle w:val="BodyText"/>
       </w:pPr>
       <w:r>
@@ -7647,8 +8002,8 @@
         <w:t xml:space="preserve">exchanges work, so that prior is wrong, and the model applies it anyway.</w:t>
       </w:r>
     </w:p>
-    <w:bookmarkEnd w:id="38"/>
-    <w:bookmarkStart w:id="39" w:name="relation-to-the-literature"/>
+    <w:bookmarkEnd w:id="47"/>
+    <w:bookmarkStart w:id="48" w:name="relation-to-the-literature"/>
     <w:p>
       <w:pPr>
         <w:pStyle w:val="Heading3"/>
@@ -7743,9 +8098,9 @@
         </w:pict>
       </w:r>
     </w:p>
-    <w:bookmarkEnd w:id="39"/>
-    <w:bookmarkEnd w:id="40"/>
-    <w:bookmarkStart w:id="41" w:name="deployment"/>
+    <w:bookmarkEnd w:id="48"/>
+    <w:bookmarkEnd w:id="49"/>
+    <w:bookmarkStart w:id="50" w:name="deployment"/>
     <w:p>
       <w:pPr>
         <w:pStyle w:val="Heading2"/>
@@ -7874,8 +8229,8 @@
         </w:pict>
       </w:r>
     </w:p>
-    <w:bookmarkEnd w:id="41"/>
-    <w:bookmarkStart w:id="42" w:name="limitations-and-future-work"/>
+    <w:bookmarkEnd w:id="50"/>
+    <w:bookmarkStart w:id="51" w:name="limitations-and-future-work"/>
     <w:p>
       <w:pPr>
         <w:pStyle w:val="Heading2"/>
@@ -8201,8 +8556,8 @@
         </w:pict>
       </w:r>
     </w:p>
-    <w:bookmarkEnd w:id="42"/>
-    <w:bookmarkStart w:id="43" w:name="conclusion"/>
+    <w:bookmarkEnd w:id="51"/>
+    <w:bookmarkStart w:id="52" w:name="conclusion"/>
     <w:p>
       <w:pPr>
         <w:pStyle w:val="Heading2"/>
@@ -8326,8 +8681,8 @@
         </w:pict>
       </w:r>
     </w:p>
-    <w:bookmarkEnd w:id="43"/>
-    <w:bookmarkStart w:id="44" w:name="references"/>
+    <w:bookmarkEnd w:id="52"/>
+    <w:bookmarkStart w:id="53" w:name="references"/>
     <w:p>
       <w:pPr>
         <w:pStyle w:val="Heading2"/>
@@ -8397,6 +8752,60 @@
         <w:pStyle w:val="BodyText"/>
       </w:pPr>
       <w:r>
+        <w:t xml:space="preserve">Adelani, D. I., Doğruöz, A. S., Coneglian, A., &amp; Ojha, A. K. (2024). Does</w:t>
+      </w:r>
+      <w:r>
+        <w:t xml:space="preserve"> </w:t>
+      </w:r>
+      <w:r>
+        <w:t xml:space="preserve">generative AI speak Nigerian-Pidgin? Issues about representativeness and bias</w:t>
+      </w:r>
+      <w:r>
+        <w:t xml:space="preserve"> </w:t>
+      </w:r>
+      <w:r>
+        <w:t xml:space="preserve">for multilingualism in LLMs.</w:t>
+      </w:r>
+      <w:r>
+        <w:t xml:space="preserve"> </w:t>
+      </w:r>
+      <w:r>
+        <w:rPr>
+          <w:i/>
+          <w:iCs/>
+        </w:rPr>
+        <w:t xml:space="preserve">arXiv:2404.19442</w:t>
+      </w:r>
+      <w:r>
+        <w:t xml:space="preserve">.</w:t>
+      </w:r>
+    </w:p>
+    <w:p>
+      <w:pPr>
+        <w:pStyle w:val="BodyText"/>
+      </w:pPr>
+      <w:r>
+        <w:t xml:space="preserve">Chainalysis. (2026).</w:t>
+      </w:r>
+      <w:r>
+        <w:t xml:space="preserve"> </w:t>
+      </w:r>
+      <w:r>
+        <w:rPr>
+          <w:i/>
+          <w:iCs/>
+        </w:rPr>
+        <w:t xml:space="preserve">The 2026 Global Crypto Adoption Index</w:t>
+      </w:r>
+      <w:r>
+        <w:t xml:space="preserve">. Chainalysis.</w:t>
+      </w:r>
+    </w:p>
+    <w:p>
+      <w:pPr>
+        <w:pStyle w:val="BodyText"/>
+      </w:pPr>
+      <w:r>
         <w:t xml:space="preserve">Conneau, A., Khandelwal, K., Goyal, N., Chaudhary, V., Wenzek, G., Guzmán, F.,</w:t>
       </w:r>
       <w:r>
@@ -8777,8 +9186,8 @@
         </w:pict>
       </w:r>
     </w:p>
-    <w:bookmarkEnd w:id="44"/>
-    <w:bookmarkStart w:id="45" w:name="acknowledgement-of-ai-assistance"/>
+    <w:bookmarkEnd w:id="53"/>
+    <w:bookmarkStart w:id="54" w:name="acknowledgement-of-ai-assistance"/>
     <w:p>
       <w:pPr>
         <w:pStyle w:val="Heading2"/>
@@ -8858,8 +9267,8 @@
         <w:t xml:space="preserve">the annotation, and the interpretation presented here.</w:t>
       </w:r>
     </w:p>
-    <w:bookmarkEnd w:id="45"/>
-    <w:bookmarkEnd w:id="46"/>
+    <w:bookmarkEnd w:id="54"/>
+    <w:bookmarkEnd w:id="55"/>
     <w:sectPr>
       <w:footnotePr>
         <w:numRestart w:val="eachSect"/>

</xml_diff>